<commit_message>
Deploying to gh-pages from @ Morrison-Lab/pds@3acb1d53285908ef0070f556fb9e30af19b1d0f3 🚀
</commit_message>
<xml_diff>
--- a/notation.docx
+++ b/notation.docx
@@ -15,7 +15,7 @@
         <w:pStyle w:val="Date"/>
       </w:pPr>
       <w:r>
-        <w:t xml:space="preserve">Last modified: 2026-09-28 02:25:27 (PDT)</w:t>
+        <w:t xml:space="preserve">Last modified: 2026-09-28 03:06:27 (PDT)</w:t>
       </w:r>
     </w:p>
     <w:p>
@@ -904,7 +904,7 @@
         <w:t xml:space="preserve">.</w:t>
       </w:r>
     </w:p>
-    <w:bookmarkStart w:id="24" w:name="sec-stochastic-probabilistic-random"/>
+    <w:bookmarkStart w:id="27" w:name="sec-stochastic-probabilistic-random"/>
     <w:p>
       <w:pPr>
         <w:pStyle w:val="Heading2"/>
@@ -963,7 +963,7 @@
         <w:t xml:space="preserve">but they carry nuanced technical distinctions.</w:t>
       </w:r>
     </w:p>
-    <w:bookmarkStart w:id="12" w:name="Xb824105725c714fb62d41c87a09d9013ca5949f"/>
+    <w:bookmarkStart w:id="20" w:name="Xb824105725c714fb62d41c87a09d9013ca5949f"/>
     <w:p>
       <w:pPr>
         <w:pStyle w:val="Heading3"/>
@@ -1046,241 +1046,249 @@
         <w:t xml:space="preserve">in everyday conversation these terms are often used interchangeably.</w:t>
       </w:r>
     </w:p>
-    <w:bookmarkEnd w:id="12"/>
-    <w:bookmarkStart w:id="17" w:name="definitions"/>
     <w:p>
       <w:pPr>
-        <w:pStyle w:val="Heading3"/>
-      </w:pPr>
-      <w:r>
-        <w:t xml:space="preserve">1.2 Definitions</w:t>
-      </w:r>
+        <w:pStyle w:val="FirstParagraph"/>
+      </w:pPr>
+      <w:bookmarkStart w:id="12" w:name="definitions"/>
+      <w:bookmarkEnd w:id="12"/>
     </w:p>
+    <w:bookmarkStart w:id="13" w:name="def-random"/>
     <w:p>
       <w:pPr>
-        <w:pStyle w:val="FirstParagraph"/>
+        <w:pStyle w:val="BodyText"/>
       </w:pPr>
       <w:r>
         <w:rPr>
           <w:b/>
           <w:bCs/>
         </w:rPr>
-        <w:t xml:space="preserve">Random</w:t>
-      </w:r>
-      <w:r>
-        <w:t xml:space="preserve"> </w:t>
-      </w:r>
-      <w:r>
-        <w:t xml:space="preserve">describes something that occurs by chance,</w:t>
-      </w:r>
-      <w:r>
-        <w:t xml:space="preserve"> </w:t>
-      </w:r>
-      <w:r>
-        <w:t xml:space="preserve">without a deterministic pattern.</w:t>
-      </w:r>
-      <w:r>
-        <w:t xml:space="preserve"> </w:t>
-      </w:r>
-      <w:r>
-        <w:t xml:space="preserve">It is the most general term,</w:t>
-      </w:r>
-      <w:r>
-        <w:t xml:space="preserve"> </w:t>
-      </w:r>
-      <w:r>
-        <w:t xml:space="preserve">used to describe variables or occurrences whose outcome cannot be predicted precisely,</w:t>
-      </w:r>
-      <w:r>
-        <w:t xml:space="preserve"> </w:t>
-      </w:r>
-      <w:r>
-        <w:t xml:space="preserve">only probabilistically.</w:t>
-      </w:r>
-      <w:r>
-        <w:t xml:space="preserve"> </w:t>
-      </w:r>
-      <w:r>
-        <w:t xml:space="preserve">For example,</w:t>
-      </w:r>
-      <w:r>
-        <w:t xml:space="preserve"> </w:t>
-      </w:r>
-      <w:r>
-        <w:t xml:space="preserve">we speak of</w:t>
-      </w:r>
-      <w:r>
-        <w:t xml:space="preserve"> </w:t>
-      </w:r>
-      <w:r>
-        <w:t xml:space="preserve">“random variables”</w:t>
-      </w:r>
-      <w:r>
-        <w:t xml:space="preserve"> </w:t>
-      </w:r>
-      <w:r>
-        <w:t xml:space="preserve">and</w:t>
-      </w:r>
-      <w:r>
-        <w:t xml:space="preserve"> </w:t>
-      </w:r>
-      <w:r>
-        <w:t xml:space="preserve">“random events”</w:t>
-      </w:r>
-      <w:r>
-        <w:t xml:space="preserve">.</w:t>
-      </w:r>
-    </w:p>
-    <w:tbl>
-      <w:tblPr>
-        <w:tblStyle w:val="Table"/>
-        <w:tblLook w:firstRow="0" w:lastRow="0" w:firstColumn="0" w:lastColumn="0" w:noHBand="0" w:noVBand="0" w:val="0000"/>
-        <w:tblBorders>
-          <w:top w:val="single" w:sz="4" w:space="0" w:color="0758E5"/>
-          <w:left w:val="single" w:sz="24" w:space="0" w:color="0758E5"/>
-          <w:bottom w:val="single" w:sz="4" w:space="0" w:color="0758E5"/>
-          <w:right w:val="single" w:sz="4" w:space="0" w:color="0758E5"/>
-        </w:tblBorders>
-        <w:tblCellMar>
-          <w:left w:w="144" w:type="dxa"/>
-          <w:right w:w="144" w:type="dxa"/>
-        </w:tblCellMar>
-        <w:tblLook w:firstRow="0" w:lastRow="0" w:firstColumn="0" w:lastColumn="0" w:noHBand="0" w:noVBand="0" w:val="0000"/>
-      </w:tblPr>
-      <w:tr>
-        <w:trPr>
-          <w:cantSplit/>
-        </w:trPr>
-        <w:tc>
-          <w:tcPr>
-            <w:shd w:color="auto" w:fill="dae6fb" w:val="clear"/>
-            <w:tcMar>
-              <w:top w:w="92" w:type="dxa"/>
-              <w:bottom w:w="92" w:type="dxa"/>
-            </w:tcMar>
-          </w:tcPr>
-          <w:p>
-            <w:pPr>
-              <w:pStyle w:val="BodyText"/>
-            </w:pPr>
-            <w:pPr>
-              <w:spacing w:before="0" w:after="0"/>
-              <w:textAlignment w:val="center"/>
-            </w:pPr>
-            <w:r>
-              <w:drawing>
-                <wp:inline>
-                  <wp:extent cx="152400" cy="152400"/>
-                  <wp:effectExtent b="0" l="0" r="0" t="0"/>
-                  <wp:docPr descr="" title="" id="14" name="Picture"/>
-                  <a:graphic>
-                    <a:graphicData uri="http://schemas.openxmlformats.org/drawingml/2006/picture">
-                      <pic:pic>
-                        <pic:nvPicPr>
-                          <pic:cNvPr descr="/opt/quarto/share/formats/docx/note.png" id="15" name="Picture"/>
-                          <pic:cNvPicPr>
-                            <a:picLocks noChangeArrowheads="1" noChangeAspect="1"/>
-                          </pic:cNvPicPr>
-                        </pic:nvPicPr>
-                        <pic:blipFill>
-                          <a:blip r:embed="rId13"/>
-                          <a:stretch>
-                            <a:fillRect/>
-                          </a:stretch>
-                        </pic:blipFill>
-                        <pic:spPr bwMode="auto">
-                          <a:xfrm>
-                            <a:off x="0" y="0"/>
-                            <a:ext cx="152400" cy="152400"/>
-                          </a:xfrm>
-                          <a:prstGeom prst="rect">
-                            <a:avLst/>
-                          </a:prstGeom>
-                          <a:noFill/>
-                          <a:ln w="9525">
-                            <a:noFill/>
-                            <a:headEnd/>
-                            <a:tailEnd/>
-                          </a:ln>
-                        </pic:spPr>
-                      </pic:pic>
-                    </a:graphicData>
-                  </a:graphic>
-                </wp:inline>
-              </w:drawing>
-            </w:r>
-            <w:r>
-              <w:t xml:space="preserve"> </w:t>
-            </w:r>
-            <w:r>
-              <w:t xml:space="preserve"> </w:t>
-            </w:r>
-            <w:r>
-              <w:t xml:space="preserve">Note</w:t>
-            </w:r>
-          </w:p>
-        </w:tc>
-      </w:tr>
-      <w:tr>
-        <w:trPr>
-          <w:cantSplit/>
-        </w:trPr>
-        <w:tc>
-          <w:tcPr>
-            <w:tcMar>
-              <w:top w:w="108" w:type="dxa"/>
-              <w:bottom w:w="108" w:type="dxa"/>
-            </w:tcMar>
-          </w:tcPr>
-          <w:p>
-            <w:pPr>
-              <w:pStyle w:val="BodyText"/>
-            </w:pPr>
-            <w:pPr>
-              <w:spacing w:before="16" w:after="16"/>
-            </w:pPr>
-            <w:r>
-              <w:t xml:space="preserve">The term</w:t>
-            </w:r>
-            <w:r>
-              <w:t xml:space="preserve"> </w:t>
-            </w:r>
-            <w:r>
-              <w:t xml:space="preserve">“random”</w:t>
-            </w:r>
-            <w:r>
-              <w:t xml:space="preserve"> </w:t>
-            </w:r>
-            <w:r>
-              <w:t xml:space="preserve">is sometimes used as shorthand for a uniform distribution</w:t>
-            </w:r>
-            <w:r>
-              <w:t xml:space="preserve"> </w:t>
-            </w:r>
-            <w:r>
-              <w:t xml:space="preserve">(especially the discrete uniform distribution),</w:t>
-            </w:r>
-            <w:r>
-              <w:t xml:space="preserve"> </w:t>
-            </w:r>
-            <w:r>
-              <w:t xml:space="preserve">but it can refer to any probability distribution.</w:t>
-            </w:r>
-          </w:p>
-          <w:p/>
-        </w:tc>
-      </w:tr>
-    </w:tbl>
-    <w:p>
-      <w:pPr>
-        <w:pStyle w:val="BodyText"/>
-      </w:pPr>
+        <w:t xml:space="preserve">Definition 1 (Random)</w:t>
+      </w:r>
+      <w:r>
+        <w:t xml:space="preserve"> </w:t>
+      </w:r>
+      <w:r>
+        <w:t xml:space="preserve">Something is</w:t>
+      </w:r>
+      <w:r>
+        <w:t xml:space="preserve"> </w:t>
+      </w:r>
       <w:r>
         <w:rPr>
           <w:b/>
           <w:bCs/>
         </w:rPr>
-        <w:t xml:space="preserve">Stochastic</w:t>
+        <w:t xml:space="preserve">random</w:t>
+      </w:r>
+      <w:r>
+        <w:t xml:space="preserve"> </w:t>
+      </w:r>
+      <w:r>
+        <w:t xml:space="preserve">when it occurs by chance,</w:t>
+      </w:r>
+      <w:r>
+        <w:t xml:space="preserve"> </w:t>
+      </w:r>
+      <w:r>
+        <w:t xml:space="preserve">without a deterministic pattern:</w:t>
+      </w:r>
+      <w:r>
+        <w:t xml:space="preserve"> </w:t>
+      </w:r>
+      <w:r>
+        <w:t xml:space="preserve">its outcome cannot be predicted precisely,</w:t>
+      </w:r>
+      <w:r>
+        <w:t xml:space="preserve"> </w:t>
+      </w:r>
+      <w:r>
+        <w:t xml:space="preserve">only probabilistically.</w:t>
+      </w:r>
+      <w:r>
+        <w:t xml:space="preserve"> </w:t>
+      </w:r>
+      <w:r>
+        <w:t xml:space="preserve">It is the most general of the three terms,</w:t>
+      </w:r>
+      <w:r>
+        <w:t xml:space="preserve"> </w:t>
+      </w:r>
+      <w:r>
+        <w:t xml:space="preserve">used to describe variables or occurrences rather than whole processes or modeling approaches.</w:t>
+      </w:r>
+    </w:p>
+    <w:bookmarkEnd w:id="13"/>
+    <w:p>
+      <w:pPr>
+        <w:pStyle w:val="BodyText"/>
+      </w:pPr>
+      <w:r>
+        <w:t xml:space="preserve">The term</w:t>
+      </w:r>
+      <w:r>
+        <w:t xml:space="preserve"> </w:t>
+      </w:r>
+      <w:r>
+        <w:t xml:space="preserve">“random”</w:t>
+      </w:r>
+      <w:r>
+        <w:t xml:space="preserve"> </w:t>
+      </w:r>
+      <w:r>
+        <w:t xml:space="preserve">is sometimes used as shorthand for a uniform distribution</w:t>
+      </w:r>
+      <w:r>
+        <w:t xml:space="preserve"> </w:t>
+      </w:r>
+      <w:r>
+        <w:t xml:space="preserve">(especially the discrete uniform distribution),</w:t>
+      </w:r>
+      <w:r>
+        <w:t xml:space="preserve"> </w:t>
+      </w:r>
+      <w:r>
+        <w:t xml:space="preserve">but it can refer to any probability distribution.</w:t>
+      </w:r>
+    </w:p>
+    <w:bookmarkStart w:id="14" w:name="exm-random"/>
+    <w:p>
+      <w:pPr>
+        <w:pStyle w:val="BodyText"/>
+      </w:pPr>
+      <w:r>
+        <w:rPr>
+          <w:b/>
+          <w:bCs/>
+        </w:rPr>
+        <w:t xml:space="preserve">Example 1 (A random variable)</w:t>
+      </w:r>
+      <w:r>
+        <w:t xml:space="preserve"> </w:t>
+      </w:r>
+      <w:r>
+        <w:t xml:space="preserve">The result of a single die roll is random:</w:t>
+      </w:r>
+      <w:r>
+        <w:t xml:space="preserve"> </w:t>
+      </w:r>
+      <w:r>
+        <w:t xml:space="preserve">it cannot be predicted with certainty,</w:t>
+      </w:r>
+      <w:r>
+        <w:t xml:space="preserve"> </w:t>
+      </w:r>
+      <w:r>
+        <w:t xml:space="preserve">only described by the probability</w:t>
+      </w:r>
+      <w:r>
+        <w:t xml:space="preserve"> </w:t>
+      </w:r>
+      <m:oMath>
+        <m:r>
+          <m:t>1</m:t>
+        </m:r>
+        <m:r>
+          <m:rPr>
+            <m:sty m:val="p"/>
+          </m:rPr>
+          <m:t>/</m:t>
+        </m:r>
+        <m:r>
+          <m:t>6</m:t>
+        </m:r>
+      </m:oMath>
+      <w:r>
+        <w:t xml:space="preserve"> </w:t>
+      </w:r>
+      <w:r>
+        <w:t xml:space="preserve">for each face.</w:t>
+      </w:r>
+      <w:r>
+        <w:t xml:space="preserve"> </w:t>
+      </w:r>
+      <w:r>
+        <w:t xml:space="preserve">We speak of a</w:t>
+      </w:r>
+      <w:r>
+        <w:t xml:space="preserve"> </w:t>
+      </w:r>
+      <w:r>
+        <w:t xml:space="preserve">“random variable”</w:t>
+      </w:r>
+      <w:r>
+        <w:t xml:space="preserve"> </w:t>
+      </w:r>
+      <w:r>
+        <w:t xml:space="preserve">and a</w:t>
+      </w:r>
+      <w:r>
+        <w:t xml:space="preserve"> </w:t>
+      </w:r>
+      <w:r>
+        <w:t xml:space="preserve">“random event”</w:t>
+      </w:r>
+      <w:r>
+        <w:t xml:space="preserve"> </w:t>
+      </w:r>
+      <w:r>
+        <w:t xml:space="preserve">for exactly this kind of single outcome.</w:t>
+      </w:r>
+    </w:p>
+    <w:bookmarkEnd w:id="14"/>
+    <w:bookmarkStart w:id="16" w:name="def-stochastic-process"/>
+    <w:p>
+      <w:pPr>
+        <w:pStyle w:val="BodyText"/>
+      </w:pPr>
+      <w:r>
+        <w:rPr>
+          <w:b/>
+          <w:bCs/>
+        </w:rPr>
+        <w:t xml:space="preserve">Definition 2 (Stochastic process)</w:t>
+      </w:r>
+      <w:r>
+        <w:t xml:space="preserve"> </w:t>
+      </w:r>
+      <w:r>
+        <w:t xml:space="preserve">A</w:t>
+      </w:r>
+      <w:r>
+        <w:t xml:space="preserve"> </w:t>
+      </w:r>
+      <w:r>
+        <w:rPr>
+          <w:b/>
+          <w:bCs/>
+        </w:rPr>
+        <w:t xml:space="preserve">stochastic process</w:t>
+      </w:r>
+      <w:r>
+        <w:t xml:space="preserve"> </w:t>
+      </w:r>
+      <w:r>
+        <w:t xml:space="preserve">is a collection of random variables indexed by a set,</w:t>
+      </w:r>
+      <w:r>
+        <w:t xml:space="preserve"> </w:t>
+      </w:r>
+      <w:r>
+        <w:t xml:space="preserve">most often a set of times or locations.</w:t>
+      </w:r>
+    </w:p>
+    <w:p>
+      <w:pPr>
+        <w:pStyle w:val="BodyText"/>
+      </w:pPr>
+      <w:r>
+        <w:t xml:space="preserve">The word</w:t>
+      </w:r>
+      <w:r>
+        <w:t xml:space="preserve"> </w:t>
+      </w:r>
+      <w:r>
+        <w:t xml:space="preserve">“stochastic”</w:t>
       </w:r>
       <w:r>
         <w:t xml:space="preserve"> </w:t>
@@ -1367,7 +1375,7 @@
       <w:r>
         <w:t xml:space="preserve"> </w:t>
       </w:r>
-      <w:hyperlink r:id="rId16">
+      <w:hyperlink r:id="rId15">
         <w:r>
           <w:rPr>
             <w:rStyle w:val="Hyperlink"/>
@@ -1382,82 +1390,82 @@
         <w:t xml:space="preserve"> </w:t>
       </w:r>
       <w:r>
-        <w:t xml:space="preserve">In mathematics,</w:t>
-      </w:r>
-      <w:r>
-        <w:t xml:space="preserve"> </w:t>
-      </w:r>
-      <w:r>
-        <w:t xml:space="preserve">a</w:t>
-      </w:r>
-      <w:r>
-        <w:t xml:space="preserve"> </w:t>
-      </w:r>
+        <w:t xml:space="preserve">The term is almost always used for processes or systems evolving in time or space under uncertain rules,</w:t>
+      </w:r>
+      <w:r>
+        <w:t xml:space="preserve"> </w:t>
+      </w:r>
+      <w:r>
+        <w:t xml:space="preserve">rather than for a single variable or event.</w:t>
+      </w:r>
+      <w:r>
+        <w:t xml:space="preserve"> </w:t>
+      </w:r>
+      <w:r>
+        <w:t xml:space="preserve">In probability theory,</w:t>
+      </w:r>
+      <w:r>
+        <w:t xml:space="preserve"> </w:t>
+      </w:r>
+      <w:r>
+        <w:t xml:space="preserve">“stochastic process”</w:t>
+      </w:r>
+      <w:r>
+        <w:t xml:space="preserve"> </w:t>
+      </w:r>
+      <w:r>
+        <w:t xml:space="preserve">and</w:t>
+      </w:r>
+      <w:r>
+        <w:t xml:space="preserve"> </w:t>
+      </w:r>
+      <w:r>
+        <w:t xml:space="preserve">“random process”</w:t>
+      </w:r>
+      <w:r>
+        <w:t xml:space="preserve"> </w:t>
+      </w:r>
+      <w:r>
+        <w:t xml:space="preserve">are synonyms</w:t>
+      </w:r>
+      <w:r>
+        <w:t xml:space="preserve"> </w:t>
+      </w:r>
+      <w:r>
+        <w:t xml:space="preserve">(Adler and Taylor 2009; Stirzaker 2005; Kallenberg 2002)</w:t>
+      </w:r>
+      <w:r>
+        <w:t xml:space="preserve">.</w:t>
+      </w:r>
+    </w:p>
+    <w:bookmarkEnd w:id="16"/>
+    <w:bookmarkStart w:id="17" w:name="exm-stochastic-process"/>
+    <w:p>
+      <w:pPr>
+        <w:pStyle w:val="BodyText"/>
+      </w:pPr>
       <w:r>
         <w:rPr>
           <w:b/>
           <w:bCs/>
         </w:rPr>
-        <w:t xml:space="preserve">stochastic process</w:t>
-      </w:r>
-      <w:r>
-        <w:t xml:space="preserve"> </w:t>
-      </w:r>
-      <w:r>
-        <w:t xml:space="preserve">is formally defined as a collection of random variables indexed by a set,</w:t>
-      </w:r>
-      <w:r>
-        <w:t xml:space="preserve"> </w:t>
-      </w:r>
-      <w:r>
-        <w:t xml:space="preserve">most often a set of times or locations.</w:t>
-      </w:r>
-      <w:r>
-        <w:t xml:space="preserve"> </w:t>
-      </w:r>
-      <w:r>
-        <w:t xml:space="preserve">The term is almost always used in the context of processes or systems evolving in time or space under uncertain rules.</w:t>
-      </w:r>
-      <w:r>
-        <w:t xml:space="preserve"> </w:t>
-      </w:r>
-      <w:r>
-        <w:t xml:space="preserve">Note that in probability theory,</w:t>
-      </w:r>
-      <w:r>
-        <w:t xml:space="preserve"> </w:t>
-      </w:r>
-      <w:r>
-        <w:t xml:space="preserve">“stochastic process”</w:t>
-      </w:r>
-      <w:r>
-        <w:t xml:space="preserve"> </w:t>
-      </w:r>
-      <w:r>
-        <w:t xml:space="preserve">and</w:t>
-      </w:r>
-      <w:r>
-        <w:t xml:space="preserve"> </w:t>
-      </w:r>
-      <w:r>
-        <w:t xml:space="preserve">“random process”</w:t>
-      </w:r>
-      <w:r>
-        <w:t xml:space="preserve"> </w:t>
-      </w:r>
-      <w:r>
-        <w:t xml:space="preserve">are synonyms</w:t>
-      </w:r>
-      <w:r>
-        <w:t xml:space="preserve"> </w:t>
-      </w:r>
-      <w:r>
-        <w:t xml:space="preserve">(Adler and Taylor 2009; Stirzaker 2005; Kallenberg 2002)</w:t>
-      </w:r>
-      <w:r>
-        <w:t xml:space="preserve">.</w:t>
+        <w:t xml:space="preserve">Example 2 (Stock price evolution)</w:t>
+      </w:r>
+      <w:r>
+        <w:t xml:space="preserve"> </w:t>
+      </w:r>
+      <w:r>
+        <w:t xml:space="preserve">The sequence of a stock’s daily closing prices is a stochastic process:</w:t>
+      </w:r>
+      <w:r>
+        <w:t xml:space="preserve"> </w:t>
+      </w:r>
+      <w:r>
+        <w:t xml:space="preserve">a random variable (the price) indexed by a set (the trading days).</w:t>
       </w:r>
     </w:p>
+    <w:bookmarkEnd w:id="17"/>
+    <w:bookmarkStart w:id="18" w:name="def-probabilistic"/>
     <w:p>
       <w:pPr>
         <w:pStyle w:val="BodyText"/>
@@ -1467,59 +1475,308 @@
           <w:b/>
           <w:bCs/>
         </w:rPr>
-        <w:t xml:space="preserve">Probabilistic</w:t>
-      </w:r>
-      <w:r>
-        <w:t xml:space="preserve"> </w:t>
-      </w:r>
-      <w:r>
-        <w:t xml:space="preserve">refers to any model,</w:t>
-      </w:r>
-      <w:r>
-        <w:t xml:space="preserve"> </w:t>
-      </w:r>
-      <w:r>
-        <w:t xml:space="preserve">reasoning,</w:t>
-      </w:r>
-      <w:r>
-        <w:t xml:space="preserve"> </w:t>
-      </w:r>
-      <w:r>
-        <w:t xml:space="preserve">or method that explicitly involves probability theory.</w:t>
-      </w:r>
-      <w:r>
-        <w:t xml:space="preserve"> </w:t>
-      </w:r>
-      <w:r>
-        <w:t xml:space="preserve">Probabilistic models assign probabilities to events or outcomes;</w:t>
-      </w:r>
-      <w:r>
-        <w:t xml:space="preserve"> </w:t>
-      </w:r>
-      <w:r>
-        <w:t xml:space="preserve">they focus on quantifying and reasoning about uncertainty based on known or estimated distributions.</w:t>
-      </w:r>
-      <w:r>
-        <w:t xml:space="preserve"> </w:t>
-      </w:r>
-      <w:r>
-        <w:t xml:space="preserve">While all stochastic models are probabilistic (since they use probabilities),</w:t>
-      </w:r>
-      <w:r>
-        <w:t xml:space="preserve"> </w:t>
-      </w:r>
-      <w:r>
-        <w:t xml:space="preserve">not all probabilistic models need to describe processes evolving in time.</w:t>
+        <w:t xml:space="preserve">Definition 3 (Probabilistic)</w:t>
+      </w:r>
+      <w:r>
+        <w:t xml:space="preserve"> </w:t>
+      </w:r>
+      <w:r>
+        <w:t xml:space="preserve">A model, method, or line of reasoning is</w:t>
+      </w:r>
+      <w:r>
+        <w:t xml:space="preserve"> </w:t>
+      </w:r>
+      <w:r>
+        <w:rPr>
+          <w:b/>
+          <w:bCs/>
+        </w:rPr>
+        <w:t xml:space="preserve">probabilistic</w:t>
+      </w:r>
+      <w:r>
+        <w:t xml:space="preserve"> </w:t>
+      </w:r>
+      <w:r>
+        <w:t xml:space="preserve">when it explicitly involves probability theory:</w:t>
+      </w:r>
+      <w:r>
+        <w:t xml:space="preserve"> </w:t>
+      </w:r>
+      <w:r>
+        <w:t xml:space="preserve">it assigns probabilities to events or outcomes,</w:t>
+      </w:r>
+      <w:r>
+        <w:t xml:space="preserve"> </w:t>
+      </w:r>
+      <w:r>
+        <w:t xml:space="preserve">and focuses on quantifying and reasoning about uncertainty</w:t>
+      </w:r>
+      <w:r>
+        <w:t xml:space="preserve"> </w:t>
+      </w:r>
+      <w:r>
+        <w:t xml:space="preserve">based on known or estimated distributions.</w:t>
+      </w:r>
+      <w:r>
+        <w:t xml:space="preserve"> </w:t>
+      </w:r>
+      <w:r>
+        <w:t xml:space="preserve">While every stochastic model is probabilistic (since it uses probabilities),</w:t>
+      </w:r>
+      <w:r>
+        <w:t xml:space="preserve"> </w:t>
+      </w:r>
+      <w:r>
+        <w:t xml:space="preserve">not every probabilistic model needs to describe a process evolving in time.</w:t>
       </w:r>
     </w:p>
-    <w:bookmarkEnd w:id="17"/>
-    <w:bookmarkStart w:id="19" w:name="summary-of-usage"/>
+    <w:bookmarkEnd w:id="18"/>
+    <w:bookmarkStart w:id="19" w:name="exm-probabilistic"/>
     <w:p>
       <w:pPr>
+        <w:pStyle w:val="BodyText"/>
+      </w:pPr>
+      <w:r>
+        <w:rPr>
+          <w:b/>
+          <w:bCs/>
+        </w:rPr>
+        <w:t xml:space="preserve">Example 3 (A linear regression model)</w:t>
+      </w:r>
+      <w:r>
+        <w:t xml:space="preserve"> </w:t>
+      </w:r>
+      <w:r>
+        <w:t xml:space="preserve">A linear regression model with Gaussian errors,</w:t>
+      </w:r>
+      <w:r>
+        <w:t xml:space="preserve"> </w:t>
+      </w:r>
+      <m:oMath>
+        <m:r>
+          <m:t>Y</m:t>
+        </m:r>
+        <m:r>
+          <m:rPr>
+            <m:sty m:val="p"/>
+          </m:rPr>
+          <m:t>=</m:t>
+        </m:r>
+        <m:sSub>
+          <m:e>
+            <m:r>
+              <m:t>β</m:t>
+            </m:r>
+          </m:e>
+          <m:sub>
+            <m:r>
+              <m:t>0</m:t>
+            </m:r>
+          </m:sub>
+        </m:sSub>
+        <m:r>
+          <m:rPr>
+            <m:sty m:val="p"/>
+          </m:rPr>
+          <m:t>+</m:t>
+        </m:r>
+        <m:sSub>
+          <m:e>
+            <m:r>
+              <m:t>β</m:t>
+            </m:r>
+          </m:e>
+          <m:sub>
+            <m:r>
+              <m:t>1</m:t>
+            </m:r>
+          </m:sub>
+        </m:sSub>
+        <m:r>
+          <m:t>x</m:t>
+        </m:r>
+        <m:r>
+          <m:rPr>
+            <m:sty m:val="p"/>
+          </m:rPr>
+          <m:t>+</m:t>
+        </m:r>
+        <m:r>
+          <m:t>ϵ</m:t>
+        </m:r>
+      </m:oMath>
+      <w:r>
+        <w:t xml:space="preserve"> </w:t>
+      </w:r>
+      <w:r>
+        <w:t xml:space="preserve">with</w:t>
+      </w:r>
+      <w:r>
+        <w:t xml:space="preserve"> </w:t>
+      </w:r>
+      <m:oMath>
+        <m:r>
+          <m:t>ϵ</m:t>
+        </m:r>
+        <m:r>
+          <m:rPr>
+            <m:sty m:val="p"/>
+          </m:rPr>
+          <m:t>∼</m:t>
+        </m:r>
+        <m:r>
+          <m:rPr>
+            <m:sty m:val="p"/>
+          </m:rPr>
+          <m:t>N</m:t>
+        </m:r>
+        <m:r>
+          <m:t>​</m:t>
+        </m:r>
+        <m:d>
+          <m:dPr>
+            <m:begChr m:val="("/>
+            <m:sepChr m:val=""/>
+            <m:endChr m:val=")"/>
+            <m:grow/>
+          </m:dPr>
+          <m:e>
+            <m:r>
+              <m:t>0</m:t>
+            </m:r>
+            <m:r>
+              <m:rPr>
+                <m:sty m:val="p"/>
+              </m:rPr>
+              <m:t>,</m:t>
+            </m:r>
+            <m:sSup>
+              <m:e>
+                <m:r>
+                  <m:t>σ</m:t>
+                </m:r>
+              </m:e>
+              <m:sup>
+                <m:r>
+                  <m:t>2</m:t>
+                </m:r>
+              </m:sup>
+            </m:sSup>
+          </m:e>
+        </m:d>
+        <m:r>
+          <m:t>​</m:t>
+        </m:r>
+      </m:oMath>
+      <w:r>
+        <w:t xml:space="preserve">,</w:t>
+      </w:r>
+      <w:r>
+        <w:t xml:space="preserve"> </w:t>
+      </w:r>
+      <w:r>
+        <w:t xml:space="preserve">is probabilistic:</w:t>
+      </w:r>
+      <w:r>
+        <w:t xml:space="preserve"> </w:t>
+      </w:r>
+      <w:r>
+        <w:t xml:space="preserve">for each value of the covariate</w:t>
+      </w:r>
+      <w:r>
+        <w:t xml:space="preserve"> </w:t>
+      </w:r>
+      <m:oMath>
+        <m:r>
+          <m:t>x</m:t>
+        </m:r>
+      </m:oMath>
+      <w:r>
+        <w:t xml:space="preserve">,</w:t>
+      </w:r>
+      <w:r>
+        <w:t xml:space="preserve"> </w:t>
+      </w:r>
+      <w:r>
+        <w:t xml:space="preserve">it assigns a probability distribution to the outcome</w:t>
+      </w:r>
+      <w:r>
+        <w:t xml:space="preserve"> </w:t>
+      </w:r>
+      <m:oMath>
+        <m:r>
+          <m:t>Y</m:t>
+        </m:r>
+      </m:oMath>
+      <w:r>
+        <w:t xml:space="preserve">.</w:t>
+      </w:r>
+      <w:r>
+        <w:t xml:space="preserve"> </w:t>
+      </w:r>
+      <w:r>
+        <w:t xml:space="preserve">It is not a stochastic process,</w:t>
+      </w:r>
+      <w:r>
+        <w:t xml:space="preserve"> </w:t>
+      </w:r>
+      <w:r>
+        <w:t xml:space="preserve">because it describes the outcome at a given covariate value</w:t>
+      </w:r>
+      <w:r>
+        <w:t xml:space="preserve"> </w:t>
+      </w:r>
+      <w:r>
+        <w:t xml:space="preserve">rather than a process evolving in time.</w:t>
+      </w:r>
+    </w:p>
+    <w:bookmarkEnd w:id="19"/>
+    <w:p>
+      <w:pPr>
+        <w:pStyle w:val="BodyText"/>
+      </w:pPr>
+      <w:r>
+        <w:t xml:space="preserve">The model is probabilistic because of its error distribution,</w:t>
+      </w:r>
+      <w:r>
+        <w:t xml:space="preserve"> </w:t>
+      </w:r>
+      <w:r>
+        <w:t xml:space="preserve">not because of the method used to fit it.</w:t>
+      </w:r>
+      <w:r>
+        <w:t xml:space="preserve"> </w:t>
+      </w:r>
+      <w:r>
+        <w:t xml:space="preserve">The same model is probabilistic whether its parameters are estimated</w:t>
+      </w:r>
+      <w:r>
+        <w:t xml:space="preserve"> </w:t>
+      </w:r>
+      <w:r>
+        <w:t xml:space="preserve">by maximum likelihood or by Bayesian inference.</w:t>
+      </w:r>
+      <w:r>
+        <w:t xml:space="preserve"> </w:t>
+      </w:r>
+      <w:r>
+        <w:t xml:space="preserve">Bayesian inference additionally assigns a probability distribution to the parameters themselves,</w:t>
+      </w:r>
+      <w:r>
+        <w:t xml:space="preserve"> </w:t>
+      </w:r>
+      <w:r>
+        <w:t xml:space="preserve">which makes the inference method probabilistic too.</w:t>
+      </w:r>
+    </w:p>
+    <w:bookmarkEnd w:id="20"/>
+    <w:bookmarkStart w:id="22" w:name="summary-of-usage"/>
+    <w:p>
+      <w:pPr>
         <w:pStyle w:val="Heading3"/>
       </w:pPr>
       <w:r>
-        <w:t xml:space="preserve">1.3 Summary of usage</w:t>
+        <w:t xml:space="preserve">1.2 Summary of usage</w:t>
       </w:r>
     </w:p>
     <w:tbl>
@@ -1535,7 +1792,7 @@
       <w:tr>
         <w:tc>
           <w:tcPr/>
-          <w:bookmarkStart w:id="18" w:name="tbl-random-stochastic-probabilistic"/>
+          <w:bookmarkStart w:id="21" w:name="tbl-random-stochastic-probabilistic"/>
           <w:p>
             <w:pPr>
               <w:jc w:val="center"/>
@@ -1784,13 +2041,13 @@
                     <w:jc w:val="center"/>
                   </w:pPr>
                   <w:r>
-                    <w:t xml:space="preserve">Bayesian inference, regression</w:t>
+                    <w:t xml:space="preserve">Regression model, Bayesian inference</w:t>
                   </w:r>
                 </w:p>
               </w:tc>
             </w:tr>
           </w:tbl>
-          <w:bookmarkEnd w:id="18"/>
+          <w:bookmarkEnd w:id="21"/>
           <w:p/>
         </w:tc>
       </w:tr>
@@ -1869,14 +2126,14 @@
         <w:t xml:space="preserve">especially to highlight temporal or spatial structure in the modeling.</w:t>
       </w:r>
     </w:p>
-    <w:bookmarkEnd w:id="19"/>
-    <w:bookmarkStart w:id="23" w:name="additional-resources"/>
+    <w:bookmarkEnd w:id="22"/>
+    <w:bookmarkStart w:id="26" w:name="additional-resources"/>
     <w:p>
       <w:pPr>
         <w:pStyle w:val="Heading3"/>
       </w:pPr>
       <w:r>
-        <w:t xml:space="preserve">1.4 Additional resources</w:t>
+        <w:t xml:space="preserve">1.3 Additional resources</w:t>
       </w:r>
     </w:p>
     <w:p>
@@ -1904,7 +2161,7 @@
           <w:numId w:val="1002"/>
         </w:numPr>
       </w:pPr>
-      <w:hyperlink r:id="rId20">
+      <w:hyperlink r:id="rId23">
         <w:r>
           <w:rPr>
             <w:rStyle w:val="Hyperlink"/>
@@ -1921,7 +2178,7 @@
           <w:numId w:val="1002"/>
         </w:numPr>
       </w:pPr>
-      <w:hyperlink r:id="rId21">
+      <w:hyperlink r:id="rId24">
         <w:r>
           <w:rPr>
             <w:rStyle w:val="Hyperlink"/>
@@ -1938,7 +2195,7 @@
           <w:numId w:val="1002"/>
         </w:numPr>
       </w:pPr>
-      <w:hyperlink r:id="rId22">
+      <w:hyperlink r:id="rId25">
         <w:r>
           <w:rPr>
             <w:rStyle w:val="Hyperlink"/>
@@ -1947,9 +2204,9 @@
         </w:r>
       </w:hyperlink>
     </w:p>
-    <w:bookmarkEnd w:id="23"/>
-    <w:bookmarkEnd w:id="24"/>
-    <w:bookmarkStart w:id="32" w:name="references"/>
+    <w:bookmarkEnd w:id="26"/>
+    <w:bookmarkEnd w:id="27"/>
+    <w:bookmarkStart w:id="35" w:name="references"/>
     <w:p>
       <w:pPr>
         <w:pStyle w:val="Heading2"/>
@@ -1958,8 +2215,8 @@
         <w:t xml:space="preserve">References</w:t>
       </w:r>
     </w:p>
-    <w:bookmarkStart w:id="31" w:name="refs"/>
-    <w:bookmarkStart w:id="26" w:name="ref-Adler2009random"/>
+    <w:bookmarkStart w:id="34" w:name="refs"/>
+    <w:bookmarkStart w:id="29" w:name="ref-Adler2009random"/>
     <w:p>
       <w:pPr>
         <w:pStyle w:val="Bibliography"/>
@@ -1983,7 +2240,7 @@
       <w:r>
         <w:t xml:space="preserve"> </w:t>
       </w:r>
-      <w:hyperlink r:id="rId25">
+      <w:hyperlink r:id="rId28">
         <w:r>
           <w:rPr>
             <w:rStyle w:val="Hyperlink"/>
@@ -1995,8 +2252,8 @@
         <w:t xml:space="preserve">.</w:t>
       </w:r>
     </w:p>
-    <w:bookmarkEnd w:id="26"/>
-    <w:bookmarkStart w:id="28" w:name="ref-Kallenberg2002foundations"/>
+    <w:bookmarkEnd w:id="29"/>
+    <w:bookmarkStart w:id="31" w:name="ref-Kallenberg2002foundations"/>
     <w:p>
       <w:pPr>
         <w:pStyle w:val="Bibliography"/>
@@ -2020,7 +2277,7 @@
       <w:r>
         <w:t xml:space="preserve"> </w:t>
       </w:r>
-      <w:hyperlink r:id="rId27">
+      <w:hyperlink r:id="rId30">
         <w:r>
           <w:rPr>
             <w:rStyle w:val="Hyperlink"/>
@@ -2032,8 +2289,8 @@
         <w:t xml:space="preserve">.</w:t>
       </w:r>
     </w:p>
-    <w:bookmarkEnd w:id="28"/>
-    <w:bookmarkStart w:id="30" w:name="ref-Stirzaker2005probability"/>
+    <w:bookmarkEnd w:id="31"/>
+    <w:bookmarkStart w:id="33" w:name="ref-Stirzaker2005probability"/>
     <w:p>
       <w:pPr>
         <w:pStyle w:val="Bibliography"/>
@@ -2057,7 +2314,7 @@
       <w:r>
         <w:t xml:space="preserve"> </w:t>
       </w:r>
-      <w:hyperlink r:id="rId29">
+      <w:hyperlink r:id="rId32">
         <w:r>
           <w:rPr>
             <w:rStyle w:val="Hyperlink"/>
@@ -2069,9 +2326,9 @@
         <w:t xml:space="preserve">.</w:t>
       </w:r>
     </w:p>
-    <w:bookmarkEnd w:id="30"/>
-    <w:bookmarkEnd w:id="31"/>
-    <w:bookmarkEnd w:id="32"/>
+    <w:bookmarkEnd w:id="33"/>
+    <w:bookmarkEnd w:id="34"/>
+    <w:bookmarkEnd w:id="35"/>
     <w:sectPr>
       <w:footnotePr>
         <w:numRestart w:val="eachSect"/>

</xml_diff>

<commit_message>
Deploying to gh-pages from @ Morrison-Lab/pds@02479f684ac9809463d13b61861949e2978a2d05 🚀
</commit_message>
<xml_diff>
--- a/notation.docx
+++ b/notation.docx
@@ -15,7 +15,7 @@
         <w:pStyle w:val="Date"/>
       </w:pPr>
       <w:r>
-        <w:t xml:space="preserve">Last modified: 2026-10-08 23:04:50 (UTC)</w:t>
+        <w:t xml:space="preserve">Last modified: 2026-10-09 00:30:33 (UTC)</w:t>
       </w:r>
     </w:p>
     <w:p>
@@ -1632,7 +1632,7 @@
           <m:t>+</m:t>
         </m:r>
         <m:r>
-          <m:t>ϵ</m:t>
+          <m:t>ε</m:t>
         </m:r>
       </m:oMath>
       <w:r>
@@ -1646,7 +1646,7 @@
       </w:r>
       <m:oMath>
         <m:r>
-          <m:t>ϵ</m:t>
+          <m:t>ε</m:t>
         </m:r>
         <m:r>
           <m:rPr>

</xml_diff>

<commit_message>
Deploying to gh-pages from @ Morrison-Lab/pds@3ff4661c67bee638e3dc519a580f44ea4fe6a7fb 🚀
</commit_message>
<xml_diff>
--- a/notation.docx
+++ b/notation.docx
@@ -15,7 +15,7 @@
         <w:pStyle w:val="Date"/>
       </w:pPr>
       <w:r>
-        <w:t xml:space="preserve">Last modified: 2026-10-16 05:12:28 (PDT)</w:t>
+        <w:t xml:space="preserve">Last modified: 2026-10-16 15:49:22 (PDT)</w:t>
       </w:r>
     </w:p>
     <w:p>
@@ -1663,7 +1663,7 @@
           <m:t>+</m:t>
         </m:r>
         <m:r>
-          <m:t>ε</m:t>
+          <m:t>ν</m:t>
         </m:r>
       </m:oMath>
       <w:r>
@@ -1677,7 +1677,7 @@
       </w:r>
       <m:oMath>
         <m:r>
-          <m:t>ε</m:t>
+          <m:t>ν</m:t>
         </m:r>
         <m:r>
           <m:rPr>

</xml_diff>

<commit_message>
Deploying to gh-pages from @ Morrison-Lab/pds@53cac683adf30b7c806ceedf67b2b877b202e2c2 🚀
</commit_message>
<xml_diff>
--- a/notation.docx
+++ b/notation.docx
@@ -15,7 +15,7 @@
         <w:pStyle w:val="Date"/>
       </w:pPr>
       <w:r>
-        <w:t xml:space="preserve">Last modified: 2026-10-17 13:49:30 (PDT)</w:t>
+        <w:t xml:space="preserve">Last modified: 2026-10-17 20:50:12 (PDT)</w:t>
       </w:r>
     </w:p>
     <w:p>
@@ -145,24 +145,6 @@
       <w:r>
         <w:t xml:space="preserve">).</w:t>
       </w:r>
-      <w:r>
-        <w:t xml:space="preserve"> </w:t>
-      </w:r>
-      <w:r>
-        <w:t xml:space="preserve">Some sources instead use uppercase/lowercase pairs from different</w:t>
-      </w:r>
-      <w:r>
-        <w:t xml:space="preserve"> </w:t>
-      </w:r>
-      <w:r>
-        <w:t xml:space="preserve">alphabets, or reserve uppercase entirely for matrices — always check a</w:t>
-      </w:r>
-      <w:r>
-        <w:t xml:space="preserve"> </w:t>
-      </w:r>
-      <w:r>
-        <w:t xml:space="preserve">new source’s own notation section before assuming ours.</w:t>
-      </w:r>
     </w:p>
     <w:p>
       <w:pPr>
@@ -283,90 +265,6 @@
       </w:r>
       <w:r>
         <w:t xml:space="preserve">for a density.</w:t>
-      </w:r>
-      <w:r>
-        <w:t xml:space="preserve"> </w:t>
-      </w:r>
-      <w:r>
-        <w:t xml:space="preserve">Some sources use</w:t>
-      </w:r>
-      <w:r>
-        <w:t xml:space="preserve"> </w:t>
-      </w:r>
-      <m:oMath>
-        <m:r>
-          <m:t>P</m:t>
-        </m:r>
-        <m:r>
-          <m:rPr>
-            <m:sty m:val="p"/>
-          </m:rPr>
-          <m:t>(</m:t>
-        </m:r>
-        <m:r>
-          <m:rPr>
-            <m:sty m:val="p"/>
-          </m:rPr>
-          <m:t>)</m:t>
-        </m:r>
-      </m:oMath>
-      <w:r>
-        <w:t xml:space="preserve"> </w:t>
-      </w:r>
-      <w:r>
-        <w:t xml:space="preserve">(unstylized) throughout for both, or reserve</w:t>
-      </w:r>
-      <w:r>
-        <w:t xml:space="preserve"> </w:t>
-      </w:r>
-      <m:oMath>
-        <m:r>
-          <m:t>f</m:t>
-        </m:r>
-        <m:r>
-          <m:rPr>
-            <m:sty m:val="p"/>
-          </m:rPr>
-          <m:t>(</m:t>
-        </m:r>
-        <m:r>
-          <m:rPr>
-            <m:sty m:val="p"/>
-          </m:rPr>
-          <m:t>)</m:t>
-        </m:r>
-      </m:oMath>
-      <w:r>
-        <w:t xml:space="preserve"> </w:t>
-      </w:r>
-      <w:r>
-        <w:t xml:space="preserve">for densities and mass functions and use</w:t>
-      </w:r>
-      <w:r>
-        <w:t xml:space="preserve"> </w:t>
-      </w:r>
-      <m:oMath>
-        <m:r>
-          <m:t>P</m:t>
-        </m:r>
-        <m:r>
-          <m:rPr>
-            <m:sty m:val="p"/>
-          </m:rPr>
-          <m:t>(</m:t>
-        </m:r>
-        <m:r>
-          <m:rPr>
-            <m:sty m:val="p"/>
-          </m:rPr>
-          <m:t>)</m:t>
-        </m:r>
-      </m:oMath>
-      <w:r>
-        <w:t xml:space="preserve"> </w:t>
-      </w:r>
-      <w:r>
-        <w:t xml:space="preserve">only for event probabilities.</w:t>
       </w:r>
     </w:p>
     <w:p>
@@ -426,83 +324,6 @@
       <w:r>
         <w:t xml:space="preserve">, with square brackets.</w:t>
       </w:r>
-      <w:r>
-        <w:t xml:space="preserve"> </w:t>
-      </w:r>
-      <w:r>
-        <w:t xml:space="preserve">Some sources write</w:t>
-      </w:r>
-      <w:r>
-        <w:t xml:space="preserve"> </w:t>
-      </w:r>
-      <m:oMath>
-        <m:r>
-          <m:rPr>
-            <m:scr m:val="double-struck"/>
-            <m:sty m:val="p"/>
-          </m:rPr>
-          <m:t>E</m:t>
-        </m:r>
-        <m:r>
-          <m:rPr>
-            <m:sty m:val="p"/>
-          </m:rPr>
-          <m:t>[</m:t>
-        </m:r>
-        <m:r>
-          <m:rPr>
-            <m:sty m:val="p"/>
-          </m:rPr>
-          <m:t>⋅</m:t>
-        </m:r>
-        <m:r>
-          <m:rPr>
-            <m:sty m:val="p"/>
-          </m:rPr>
-          <m:t>]</m:t>
-        </m:r>
-      </m:oMath>
-      <w:r>
-        <w:t xml:space="preserve"> </w:t>
-      </w:r>
-      <w:r>
-        <w:t xml:space="preserve">(blackboard bold),</w:t>
-      </w:r>
-      <w:r>
-        <w:t xml:space="preserve"> </w:t>
-      </w:r>
-      <w:r>
-        <w:t xml:space="preserve">or use parentheses,</w:t>
-      </w:r>
-      <w:r>
-        <w:t xml:space="preserve"> </w:t>
-      </w:r>
-      <m:oMath>
-        <m:r>
-          <m:t>E</m:t>
-        </m:r>
-        <m:r>
-          <m:rPr>
-            <m:sty m:val="p"/>
-          </m:rPr>
-          <m:t>(</m:t>
-        </m:r>
-        <m:r>
-          <m:rPr>
-            <m:sty m:val="p"/>
-          </m:rPr>
-          <m:t>⋅</m:t>
-        </m:r>
-        <m:r>
-          <m:rPr>
-            <m:sty m:val="p"/>
-          </m:rPr>
-          <m:t>)</m:t>
-        </m:r>
-      </m:oMath>
-      <w:r>
-        <w:t xml:space="preserve">; the meaning is the same.</w:t>
-      </w:r>
     </w:p>
     <w:p>
       <w:pPr>
@@ -632,55 +453,6 @@
       <w:r>
         <w:t xml:space="preserve">).</w:t>
       </w:r>
-      <w:r>
-        <w:t xml:space="preserve"> </w:t>
-      </w:r>
-      <w:r>
-        <w:t xml:space="preserve">Some sources instead write</w:t>
-      </w:r>
-      <w:r>
-        <w:t xml:space="preserve"> </w:t>
-      </w:r>
-      <m:oMath>
-        <m:r>
-          <m:t>X</m:t>
-        </m:r>
-        <m:r>
-          <m:rPr>
-            <m:sty m:val="p"/>
-          </m:rPr>
-          <m:t>⟂</m:t>
-        </m:r>
-        <m:r>
-          <m:t>Y</m:t>
-        </m:r>
-      </m:oMath>
-      <w:r>
-        <w:t xml:space="preserve"> </w:t>
-      </w:r>
-      <w:r>
-        <w:t xml:space="preserve">(a single</w:t>
-      </w:r>
-      <w:r>
-        <w:t xml:space="preserve"> </w:t>
-      </w:r>
-      <m:oMath>
-        <m:r>
-          <m:rPr>
-            <m:sty m:val="p"/>
-          </m:rPr>
-          <m:t>⟂</m:t>
-        </m:r>
-      </m:oMath>
-      <w:r>
-        <w:t xml:space="preserve">)</w:t>
-      </w:r>
-      <w:r>
-        <w:t xml:space="preserve"> </w:t>
-      </w:r>
-      <w:r>
-        <w:t xml:space="preserve">or state independence only in prose.</w:t>
-      </w:r>
     </w:p>
     <w:p>
       <w:pPr>
@@ -739,53 +511,6 @@
       </w:r>
       <w:r>
         <w:t xml:space="preserve">).</w:t>
-      </w:r>
-      <w:r>
-        <w:t xml:space="preserve"> </w:t>
-      </w:r>
-      <w:r>
-        <w:t xml:space="preserve">Some sources write</w:t>
-      </w:r>
-      <w:r>
-        <w:t xml:space="preserve"> </w:t>
-      </w:r>
-      <m:oMath>
-        <m:sSup>
-          <m:e>
-            <m:r>
-              <m:t>A</m:t>
-            </m:r>
-          </m:e>
-          <m:sup>
-            <m:r>
-              <m:t>c</m:t>
-            </m:r>
-          </m:sup>
-        </m:sSup>
-      </m:oMath>
-      <w:r>
-        <w:t xml:space="preserve"> </w:t>
-      </w:r>
-      <w:r>
-        <w:t xml:space="preserve">or</w:t>
-      </w:r>
-      <w:r>
-        <w:t xml:space="preserve"> </w:t>
-      </w:r>
-      <m:oMath>
-        <m:acc>
-          <m:accPr>
-            <m:chr m:val="‾"/>
-          </m:accPr>
-          <m:e>
-            <m:r>
-              <m:t>A</m:t>
-            </m:r>
-          </m:e>
-        </m:acc>
-      </m:oMath>
-      <w:r>
-        <w:t xml:space="preserve">.</w:t>
       </w:r>
     </w:p>
     <w:p>
@@ -846,36 +571,7 @@
         <w:t xml:space="preserve"> </w:t>
       </w:r>
       <w:r>
-        <w:t xml:space="preserve">to distinguish it from an equality that follows from other</w:t>
-      </w:r>
-      <w:r>
-        <w:t xml:space="preserve"> </w:t>
-      </w:r>
-      <w:r>
-        <w:t xml:space="preserve">facts — most sources do not make this distinction typographically and</w:t>
-      </w:r>
-      <w:r>
-        <w:t xml:space="preserve"> </w:t>
-      </w:r>
-      <w:r>
-        <w:t xml:space="preserve">use a bare</w:t>
-      </w:r>
-      <w:r>
-        <w:t xml:space="preserve"> </w:t>
-      </w:r>
-      <m:oMath>
-        <m:r>
-          <m:rPr>
-            <m:sty m:val="p"/>
-          </m:rPr>
-          <m:t>=</m:t>
-        </m:r>
-      </m:oMath>
-      <w:r>
-        <w:t xml:space="preserve"> </w:t>
-      </w:r>
-      <w:r>
-        <w:t xml:space="preserve">for both.</w:t>
+        <w:t xml:space="preserve">to distinguish it from an equality that follows from other facts.</w:t>
       </w:r>
     </w:p>
     <w:p>
@@ -887,12 +583,53 @@
         </w:numPr>
       </w:pPr>
       <w:r>
+        <w:t xml:space="preserve">Other sources often use other symbols for these.</w:t>
+      </w:r>
+      <w:r>
+        <w:t xml:space="preserve"> </w:t>
+      </w:r>
+      <w:r>
+        <w:t xml:space="preserve">The</w:t>
+      </w:r>
+      <w:r>
+        <w:t xml:space="preserve"> </w:t>
+      </w:r>
+      <w:hyperlink r:id="rId10">
+        <w:r>
+          <w:rPr>
+            <w:rStyle w:val="Hyperlink"/>
+          </w:rPr>
+          <w:t xml:space="preserve">notation choices page</w:t>
+        </w:r>
+      </w:hyperlink>
+      <w:r>
+        <w:t xml:space="preserve"> </w:t>
+      </w:r>
+      <w:r>
+        <w:t xml:space="preserve">lists the alternatives; always check a new source’s own notation section</w:t>
+      </w:r>
+      <w:r>
+        <w:t xml:space="preserve"> </w:t>
+      </w:r>
+      <w:r>
+        <w:t xml:space="preserve">before assuming ours.</w:t>
+      </w:r>
+    </w:p>
+    <w:p>
+      <w:pPr>
+        <w:pStyle w:val="Compact"/>
+        <w:numPr>
+          <w:ilvl w:val="0"/>
+          <w:numId w:val="1001"/>
+        </w:numPr>
+      </w:pPr>
+      <w:r>
         <w:t xml:space="preserve">The full macro list, with more notational variants, is in</w:t>
       </w:r>
       <w:r>
         <w:t xml:space="preserve"> </w:t>
       </w:r>
-      <w:hyperlink r:id="rId10">
+      <w:hyperlink r:id="rId11">
         <w:r>
           <w:rPr>
             <w:rStyle w:val="VerbatimChar"/>
@@ -904,7 +641,7 @@
         <w:t xml:space="preserve">.</w:t>
       </w:r>
     </w:p>
-    <w:bookmarkStart w:id="28" w:name="sec-stochastic-probabilistic-random"/>
+    <w:bookmarkStart w:id="29" w:name="sec-stochastic-probabilistic-random"/>
     <w:p>
       <w:pPr>
         <w:pStyle w:val="Heading2"/>
@@ -973,7 +710,7 @@
         <w:t xml:space="preserve">but they carry nuanced technical distinctions.</w:t>
       </w:r>
     </w:p>
-    <w:bookmarkStart w:id="21" w:name="Xb824105725c714fb62d41c87a09d9013ca5949f"/>
+    <w:bookmarkStart w:id="22" w:name="Xb824105725c714fb62d41c87a09d9013ca5949f"/>
     <w:p>
       <w:pPr>
         <w:pStyle w:val="Heading3"/>
@@ -1002,7 +739,7 @@
       <w:r>
         <w:t xml:space="preserve"> </w:t>
       </w:r>
-      <w:hyperlink r:id="rId11">
+      <w:hyperlink r:id="rId12">
         <w:r>
           <w:rPr>
             <w:rStyle w:val="Hyperlink"/>
@@ -1070,10 +807,10 @@
       <w:pPr>
         <w:pStyle w:val="FirstParagraph"/>
       </w:pPr>
-      <w:bookmarkStart w:id="12" w:name="definitions"/>
-      <w:bookmarkEnd w:id="12"/>
-    </w:p>
-    <w:bookmarkStart w:id="13" w:name="def-random"/>
+      <w:bookmarkStart w:id="13" w:name="definitions"/>
+      <w:bookmarkEnd w:id="13"/>
+    </w:p>
+    <w:bookmarkStart w:id="14" w:name="def-random"/>
     <w:p>
       <w:pPr>
         <w:pStyle w:val="BodyText"/>
@@ -1138,7 +875,7 @@
         <w:t xml:space="preserve">used to describe variables or occurrences rather than whole processes or modeling approaches.</w:t>
       </w:r>
     </w:p>
-    <w:bookmarkEnd w:id="13"/>
+    <w:bookmarkEnd w:id="14"/>
     <w:p>
       <w:pPr>
         <w:pStyle w:val="BodyText"/>
@@ -1181,7 +918,7 @@
         <w:t xml:space="preserve">but it can refer to any probability distribution.</w:t>
       </w:r>
     </w:p>
-    <w:bookmarkStart w:id="14" w:name="exm-random"/>
+    <w:bookmarkStart w:id="15" w:name="exm-random"/>
     <w:p>
       <w:pPr>
         <w:pStyle w:val="BodyText"/>
@@ -1265,8 +1002,8 @@
         <w:t xml:space="preserve">for exactly this kind of single outcome.</w:t>
       </w:r>
     </w:p>
-    <w:bookmarkEnd w:id="14"/>
-    <w:bookmarkStart w:id="15" w:name="def-stochastic-process"/>
+    <w:bookmarkEnd w:id="15"/>
+    <w:bookmarkStart w:id="16" w:name="def-stochastic-process"/>
     <w:p>
       <w:pPr>
         <w:pStyle w:val="BodyText"/>
@@ -1356,8 +1093,8 @@
         <w:t xml:space="preserve">.</w:t>
       </w:r>
     </w:p>
-    <w:bookmarkEnd w:id="15"/>
-    <w:bookmarkStart w:id="17" w:name="rem-stochastic-process-word"/>
+    <w:bookmarkEnd w:id="16"/>
+    <w:bookmarkStart w:id="18" w:name="rem-stochastic-process-word"/>
     <w:p>
       <w:pPr>
         <w:pStyle w:val="BodyText"/>
@@ -1475,7 +1212,7 @@
       <w:r>
         <w:t xml:space="preserve"> </w:t>
       </w:r>
-      <w:hyperlink r:id="rId16">
+      <w:hyperlink r:id="rId17">
         <w:r>
           <w:rPr>
             <w:rStyle w:val="Hyperlink"/>
@@ -1499,8 +1236,8 @@
         <w:t xml:space="preserve">rather than for a single variable or event.</w:t>
       </w:r>
     </w:p>
-    <w:bookmarkEnd w:id="17"/>
-    <w:bookmarkStart w:id="18" w:name="exm-stochastic-process"/>
+    <w:bookmarkEnd w:id="18"/>
+    <w:bookmarkStart w:id="19" w:name="exm-stochastic-process"/>
     <w:p>
       <w:pPr>
         <w:pStyle w:val="BodyText"/>
@@ -1525,8 +1262,8 @@
         <w:t xml:space="preserve">a random variable (the price) indexed by a set (the trading days).</w:t>
       </w:r>
     </w:p>
-    <w:bookmarkEnd w:id="18"/>
-    <w:bookmarkStart w:id="19" w:name="def-probabilistic"/>
+    <w:bookmarkEnd w:id="19"/>
+    <w:bookmarkStart w:id="20" w:name="def-probabilistic"/>
     <w:p>
       <w:pPr>
         <w:pStyle w:val="BodyText"/>
@@ -1591,8 +1328,8 @@
         <w:t xml:space="preserve">not every probabilistic model needs to describe a process evolving in time.</w:t>
       </w:r>
     </w:p>
-    <w:bookmarkEnd w:id="19"/>
-    <w:bookmarkStart w:id="20" w:name="exm-probabilistic"/>
+    <w:bookmarkEnd w:id="20"/>
+    <w:bookmarkStart w:id="21" w:name="exm-probabilistic"/>
     <w:p>
       <w:pPr>
         <w:pStyle w:val="BodyText"/>
@@ -1791,7 +1528,7 @@
         <w:t xml:space="preserve">rather than a process evolving in time.</w:t>
       </w:r>
     </w:p>
-    <w:bookmarkEnd w:id="20"/>
+    <w:bookmarkEnd w:id="21"/>
     <w:p>
       <w:pPr>
         <w:pStyle w:val="BodyText"/>
@@ -1840,8 +1577,8 @@
         <w:t xml:space="preserve">which makes the inference method probabilistic too.</w:t>
       </w:r>
     </w:p>
-    <w:bookmarkEnd w:id="21"/>
-    <w:bookmarkStart w:id="23" w:name="summary-of-usage"/>
+    <w:bookmarkEnd w:id="22"/>
+    <w:bookmarkStart w:id="24" w:name="summary-of-usage"/>
     <w:p>
       <w:pPr>
         <w:pStyle w:val="Heading3"/>
@@ -1863,7 +1600,7 @@
       <w:tr>
         <w:tc>
           <w:tcPr/>
-          <w:bookmarkStart w:id="22" w:name="tbl-random-stochastic-probabilistic"/>
+          <w:bookmarkStart w:id="23" w:name="tbl-random-stochastic-probabilistic"/>
           <w:p>
             <w:pPr>
               <w:jc w:val="center"/>
@@ -2118,7 +1855,7 @@
               </w:tc>
             </w:tr>
           </w:tbl>
-          <w:bookmarkEnd w:id="22"/>
+          <w:bookmarkEnd w:id="23"/>
           <w:p/>
         </w:tc>
       </w:tr>
@@ -2207,8 +1944,8 @@
         <w:t xml:space="preserve">especially to highlight temporal or spatial structure in the modeling.</w:t>
       </w:r>
     </w:p>
-    <w:bookmarkEnd w:id="23"/>
-    <w:bookmarkStart w:id="27" w:name="additional-resources"/>
+    <w:bookmarkEnd w:id="24"/>
+    <w:bookmarkStart w:id="28" w:name="additional-resources"/>
     <w:p>
       <w:pPr>
         <w:pStyle w:val="Heading3"/>
@@ -2240,7 +1977,7 @@
           <w:numId w:val="1002"/>
         </w:numPr>
       </w:pPr>
-      <w:hyperlink r:id="rId11">
+      <w:hyperlink r:id="rId12">
         <w:r>
           <w:rPr>
             <w:rStyle w:val="Hyperlink"/>
@@ -2257,7 +1994,7 @@
           <w:numId w:val="1002"/>
         </w:numPr>
       </w:pPr>
-      <w:hyperlink r:id="rId24">
+      <w:hyperlink r:id="rId25">
         <w:r>
           <w:rPr>
             <w:rStyle w:val="Hyperlink"/>
@@ -2274,7 +2011,7 @@
           <w:numId w:val="1002"/>
         </w:numPr>
       </w:pPr>
-      <w:hyperlink r:id="rId25">
+      <w:hyperlink r:id="rId26">
         <w:r>
           <w:rPr>
             <w:rStyle w:val="Hyperlink"/>
@@ -2291,7 +2028,7 @@
           <w:numId w:val="1002"/>
         </w:numPr>
       </w:pPr>
-      <w:hyperlink r:id="rId26">
+      <w:hyperlink r:id="rId27">
         <w:r>
           <w:rPr>
             <w:rStyle w:val="Hyperlink"/>
@@ -2300,9 +2037,9 @@
         </w:r>
       </w:hyperlink>
     </w:p>
-    <w:bookmarkEnd w:id="27"/>
     <w:bookmarkEnd w:id="28"/>
-    <w:bookmarkStart w:id="36" w:name="references"/>
+    <w:bookmarkEnd w:id="29"/>
+    <w:bookmarkStart w:id="37" w:name="references"/>
     <w:p>
       <w:pPr>
         <w:pStyle w:val="Heading2"/>
@@ -2311,8 +2048,8 @@
         <w:t xml:space="preserve">References</w:t>
       </w:r>
     </w:p>
-    <w:bookmarkStart w:id="35" w:name="refs"/>
-    <w:bookmarkStart w:id="30" w:name="ref-Adler2009random"/>
+    <w:bookmarkStart w:id="36" w:name="refs"/>
+    <w:bookmarkStart w:id="31" w:name="ref-Adler2009random"/>
     <w:p>
       <w:pPr>
         <w:pStyle w:val="Bibliography"/>
@@ -2336,7 +2073,7 @@
       <w:r>
         <w:t xml:space="preserve"> </w:t>
       </w:r>
-      <w:hyperlink r:id="rId29">
+      <w:hyperlink r:id="rId30">
         <w:r>
           <w:rPr>
             <w:rStyle w:val="Hyperlink"/>
@@ -2348,8 +2085,8 @@
         <w:t xml:space="preserve">.</w:t>
       </w:r>
     </w:p>
-    <w:bookmarkEnd w:id="30"/>
-    <w:bookmarkStart w:id="32" w:name="ref-Kallenberg2002foundations"/>
+    <w:bookmarkEnd w:id="31"/>
+    <w:bookmarkStart w:id="33" w:name="ref-Kallenberg2002foundations"/>
     <w:p>
       <w:pPr>
         <w:pStyle w:val="Bibliography"/>
@@ -2373,7 +2110,7 @@
       <w:r>
         <w:t xml:space="preserve"> </w:t>
       </w:r>
-      <w:hyperlink r:id="rId31">
+      <w:hyperlink r:id="rId32">
         <w:r>
           <w:rPr>
             <w:rStyle w:val="Hyperlink"/>
@@ -2385,8 +2122,8 @@
         <w:t xml:space="preserve">.</w:t>
       </w:r>
     </w:p>
-    <w:bookmarkEnd w:id="32"/>
-    <w:bookmarkStart w:id="34" w:name="ref-Stirzaker2005probability"/>
+    <w:bookmarkEnd w:id="33"/>
+    <w:bookmarkStart w:id="35" w:name="ref-Stirzaker2005probability"/>
     <w:p>
       <w:pPr>
         <w:pStyle w:val="Bibliography"/>
@@ -2410,7 +2147,7 @@
       <w:r>
         <w:t xml:space="preserve"> </w:t>
       </w:r>
-      <w:hyperlink r:id="rId33">
+      <w:hyperlink r:id="rId34">
         <w:r>
           <w:rPr>
             <w:rStyle w:val="Hyperlink"/>
@@ -2422,9 +2159,9 @@
         <w:t xml:space="preserve">.</w:t>
       </w:r>
     </w:p>
-    <w:bookmarkEnd w:id="34"/>
     <w:bookmarkEnd w:id="35"/>
     <w:bookmarkEnd w:id="36"/>
+    <w:bookmarkEnd w:id="37"/>
     <w:sectPr>
       <w:footnotePr>
         <w:numRestart w:val="eachSect"/>

</xml_diff>